<commit_message>
add @media update doc
</commit_message>
<xml_diff>
--- a/Python Web課程.docx
+++ b/Python Web課程.docx
@@ -586,6 +586,38 @@
           <w:rtl w:val="0"/>
         </w:rPr>
         <w:t xml:space="preserve">4.JavaScript</w:t>
+      </w:r>
+    </w:p>
+    <w:p>
+      <w:pPr>
+        <w:spacing w:after="240" w:before="240" w:lineRule="auto"/>
+        <w:rPr>
+          <w:rFonts w:ascii="Times New Roman" w:cs="Times New Roman" w:eastAsia="Times New Roman" w:hAnsi="Times New Roman"/>
+          <w:b w:val="1"/>
+          <w:sz w:val="32"/>
+          <w:szCs w:val="32"/>
+          <w:highlight w:val="white"/>
+        </w:rPr>
+      </w:pPr>
+      <w:hyperlink r:id="rId11">
+        <w:r>
+          <w:rPr>
+            <w:rFonts w:ascii="Times New Roman" w:cs="Times New Roman" w:eastAsia="Times New Roman" w:hAnsi="Times New Roman"/>
+            <w:b w:val="1"/>
+            <w:color w:val="1155cc"/>
+            <w:sz w:val="32"/>
+            <w:szCs w:val="32"/>
+            <w:highlight w:val="white"/>
+            <w:u w:val="single"/>
+            <w:rtl w:val="0"/>
+          </w:rPr>
+          <w:t xml:space="preserve">https://drive.google.com/drive/folders/16mm7ypH5JmqEnpv1J6yLWR2LnaC1pv1d?usp=sharing</w:t>
+        </w:r>
+      </w:hyperlink>
+      <w:r>
+        <w:rPr>
+          <w:rtl w:val="0"/>
+        </w:rPr>
       </w:r>
     </w:p>
     <w:p>

</xml_diff>

<commit_message>
update table from jerry
</commit_message>
<xml_diff>
--- a/Python Web課程.docx
+++ b/Python Web課程.docx
@@ -170,24 +170,6 @@
       </w:pPr>
       <w:r>
         <w:rPr>
-          <w:rtl w:val="0"/>
-        </w:rPr>
-      </w:r>
-    </w:p>
-    <w:p>
-      <w:pPr>
-        <w:spacing w:after="240" w:before="240" w:lineRule="auto"/>
-        <w:jc w:val="left"/>
-        <w:rPr>
-          <w:rFonts w:ascii="Times New Roman" w:cs="Times New Roman" w:eastAsia="Times New Roman" w:hAnsi="Times New Roman"/>
-          <w:color w:val="1155cc"/>
-          <w:sz w:val="28"/>
-          <w:szCs w:val="28"/>
-          <w:u w:val="single"/>
-        </w:rPr>
-      </w:pPr>
-      <w:r>
-        <w:rPr>
           <w:rFonts w:ascii="Times New Roman" w:cs="Times New Roman" w:eastAsia="Times New Roman" w:hAnsi="Times New Roman"/>
           <w:color w:val="1155cc"/>
           <w:sz w:val="28"/>
@@ -234,42 +216,6 @@
           <w:t xml:space="preserve">https://github.com/jerrytw0923/html-demo</w:t>
         </w:r>
       </w:hyperlink>
-      <w:r>
-        <w:rPr>
-          <w:rtl w:val="0"/>
-        </w:rPr>
-      </w:r>
-    </w:p>
-    <w:p>
-      <w:pPr>
-        <w:spacing w:after="240" w:before="240" w:lineRule="auto"/>
-        <w:jc w:val="left"/>
-        <w:rPr>
-          <w:rFonts w:ascii="Times New Roman" w:cs="Times New Roman" w:eastAsia="Times New Roman" w:hAnsi="Times New Roman"/>
-          <w:color w:val="1155cc"/>
-          <w:sz w:val="28"/>
-          <w:szCs w:val="28"/>
-          <w:u w:val="single"/>
-        </w:rPr>
-      </w:pPr>
-      <w:r>
-        <w:rPr>
-          <w:rtl w:val="0"/>
-        </w:rPr>
-      </w:r>
-    </w:p>
-    <w:p>
-      <w:pPr>
-        <w:spacing w:after="240" w:before="240" w:lineRule="auto"/>
-        <w:jc w:val="left"/>
-        <w:rPr>
-          <w:rFonts w:ascii="Times New Roman" w:cs="Times New Roman" w:eastAsia="Times New Roman" w:hAnsi="Times New Roman"/>
-          <w:color w:val="1155cc"/>
-          <w:sz w:val="28"/>
-          <w:szCs w:val="28"/>
-          <w:u w:val="single"/>
-        </w:rPr>
-      </w:pPr>
       <w:r>
         <w:rPr>
           <w:rtl w:val="0"/>
@@ -561,23 +507,6 @@
       </w:pPr>
       <w:r>
         <w:rPr>
-          <w:rtl w:val="0"/>
-        </w:rPr>
-      </w:r>
-    </w:p>
-    <w:p>
-      <w:pPr>
-        <w:spacing w:after="240" w:before="240" w:lineRule="auto"/>
-        <w:rPr>
-          <w:rFonts w:ascii="Times New Roman" w:cs="Times New Roman" w:eastAsia="Times New Roman" w:hAnsi="Times New Roman"/>
-          <w:b w:val="1"/>
-          <w:sz w:val="32"/>
-          <w:szCs w:val="32"/>
-          <w:highlight w:val="white"/>
-        </w:rPr>
-      </w:pPr>
-      <w:r>
-        <w:rPr>
           <w:rFonts w:ascii="Times New Roman" w:cs="Times New Roman" w:eastAsia="Times New Roman" w:hAnsi="Times New Roman"/>
           <w:b w:val="1"/>
           <w:sz w:val="32"/>
@@ -650,23 +579,6 @@
       </w:pPr>
       <w:r>
         <w:rPr>
-          <w:rtl w:val="0"/>
-        </w:rPr>
-      </w:r>
-    </w:p>
-    <w:p>
-      <w:pPr>
-        <w:spacing w:after="240" w:before="240" w:lineRule="auto"/>
-        <w:rPr>
-          <w:rFonts w:ascii="Times New Roman" w:cs="Times New Roman" w:eastAsia="Times New Roman" w:hAnsi="Times New Roman"/>
-          <w:b w:val="1"/>
-          <w:sz w:val="32"/>
-          <w:szCs w:val="32"/>
-          <w:highlight w:val="white"/>
-        </w:rPr>
-      </w:pPr>
-      <w:r>
-        <w:rPr>
           <w:rFonts w:ascii="Gungsuh" w:cs="Gungsuh" w:eastAsia="Gungsuh" w:hAnsi="Gungsuh"/>
           <w:b w:val="1"/>
           <w:sz w:val="32"/>
@@ -711,6 +623,55 @@
           <w:highlight w:val="white"/>
         </w:rPr>
       </w:pPr>
+      <w:hyperlink r:id="rId12">
+        <w:r>
+          <w:rPr>
+            <w:rFonts w:ascii="Times New Roman" w:cs="Times New Roman" w:eastAsia="Times New Roman" w:hAnsi="Times New Roman"/>
+            <w:b w:val="1"/>
+            <w:color w:val="1155cc"/>
+            <w:sz w:val="32"/>
+            <w:szCs w:val="32"/>
+            <w:highlight w:val="white"/>
+            <w:u w:val="single"/>
+            <w:rtl w:val="0"/>
+          </w:rPr>
+          <w:t xml:space="preserve">https://drive.google.com/drive/folders/1-ChHtnp6YjDNr6hzPvDknXPfzurPQx79?usp=drive_link</w:t>
+        </w:r>
+      </w:hyperlink>
+      <w:r>
+        <w:rPr>
+          <w:rtl w:val="0"/>
+        </w:rPr>
+      </w:r>
+    </w:p>
+    <w:p>
+      <w:pPr>
+        <w:spacing w:after="240" w:before="240" w:lineRule="auto"/>
+        <w:rPr>
+          <w:rFonts w:ascii="Times New Roman" w:cs="Times New Roman" w:eastAsia="Times New Roman" w:hAnsi="Times New Roman"/>
+          <w:b w:val="1"/>
+          <w:sz w:val="32"/>
+          <w:szCs w:val="32"/>
+          <w:highlight w:val="white"/>
+        </w:rPr>
+      </w:pPr>
+      <w:r>
+        <w:rPr>
+          <w:rtl w:val="0"/>
+        </w:rPr>
+      </w:r>
+    </w:p>
+    <w:p>
+      <w:pPr>
+        <w:spacing w:after="240" w:before="240" w:lineRule="auto"/>
+        <w:rPr>
+          <w:rFonts w:ascii="Times New Roman" w:cs="Times New Roman" w:eastAsia="Times New Roman" w:hAnsi="Times New Roman"/>
+          <w:b w:val="1"/>
+          <w:sz w:val="32"/>
+          <w:szCs w:val="32"/>
+          <w:highlight w:val="white"/>
+        </w:rPr>
+      </w:pPr>
       <w:r>
         <w:rPr>
           <w:rtl w:val="0"/>
@@ -795,6 +756,38 @@
           <w:rtl w:val="0"/>
         </w:rPr>
         <w:t xml:space="preserve">6.Flask</w:t>
+      </w:r>
+    </w:p>
+    <w:p>
+      <w:pPr>
+        <w:spacing w:after="240" w:before="240" w:lineRule="auto"/>
+        <w:rPr>
+          <w:rFonts w:ascii="Times New Roman" w:cs="Times New Roman" w:eastAsia="Times New Roman" w:hAnsi="Times New Roman"/>
+          <w:b w:val="1"/>
+          <w:sz w:val="32"/>
+          <w:szCs w:val="32"/>
+          <w:highlight w:val="white"/>
+        </w:rPr>
+      </w:pPr>
+      <w:hyperlink r:id="rId13">
+        <w:r>
+          <w:rPr>
+            <w:rFonts w:ascii="Times New Roman" w:cs="Times New Roman" w:eastAsia="Times New Roman" w:hAnsi="Times New Roman"/>
+            <w:b w:val="1"/>
+            <w:color w:val="1155cc"/>
+            <w:sz w:val="32"/>
+            <w:szCs w:val="32"/>
+            <w:highlight w:val="white"/>
+            <w:u w:val="single"/>
+            <w:rtl w:val="0"/>
+          </w:rPr>
+          <w:t xml:space="preserve">https://drive.google.com/drive/folders/1i2DS0dYXpmOMzEU__rs1h-UVVRcWzjGM?usp=drive_link</w:t>
+        </w:r>
+      </w:hyperlink>
+      <w:r>
+        <w:rPr>
+          <w:rtl w:val="0"/>
+        </w:rPr>
       </w:r>
     </w:p>
     <w:p>

</xml_diff>